<commit_message>
fix: simplified multi-question quizzes into 1 single clean YouTube Live chat question across all class scripts
</commit_message>
<xml_diff>
--- a/referencias/GUIONES/Guion_Dia2_La_Cuenta_Espejo.docx
+++ b/referencias/GUIONES/Guion_Dia2_La_Cuenta_Espejo.docx
@@ -5415,21 +5415,16 @@
               <w:rPr/>
             </w:pPr>
             <w:r>
-              <w:rPr>
-                <w:rFonts w:ascii="Arial Unicode MS" w:cs="Arial Unicode MS" w:eastAsia="Arial Unicode MS" w:hAnsi="Arial Unicode MS"/>
-                <w:b w:val="1"/>
-                <w:bCs w:val="1"/>
-                <w:color w:val="9fb3c8"/>
-                <w:sz w:val="15"/>
-                <w:szCs w:val="15"/>
-                <w:rtl w:val="0"/>
-              </w:rPr>
-              <w:t>31:00 → 35:00</w:t>
-            </w:r>
-            <w:r>
-              <w:rPr>
-                <w:rtl w:val="0"/>
-              </w:rPr>
+              <w:t>⚡ PREGUNTA RELÁMPAGO EN CHAT (YOUTUBE LIVE — HASTA 20 PC)</w:t>
+              <w:br/>
+              <w:t>Juan lanza 1 sola pregunta rápida al chat de YouTube:</w:t>
+              <w:br/>
+              <w:t>“¿En cuál campo de la bitácora deja huellas tu Saboteador?”</w:t>
+              <w:br/>
+              <w:t>A) El plan · B) El resultado · C) El estado emocional ✓ · D) La lección</w:t>
+              <w:br/>
+              <w:br/>
+              <w:t>Juan celebra en voz alta al primer participante en responder "C" en el chat. El CM lo anota para sumar sus +20 Puntos de Control.</w:t>
             </w:r>
           </w:p>
           <w:p>
@@ -5437,23 +5432,7 @@
               <w:spacing w:after="0" w:lineRule="auto"/>
               <w:rPr/>
             </w:pPr>
-            <w:r>
-              <w:rPr>
-                <w:rFonts w:ascii="Arial" w:cs="Arial" w:eastAsia="Arial" w:hAnsi="Arial"/>
-                <w:b w:val="1"/>
-                <w:bCs w:val="1"/>
-                <w:color w:val="ffffff"/>
-                <w:sz w:val="24"/>
-                <w:szCs w:val="24"/>
-                <w:rtl w:val="0"/>
-              </w:rPr>
-              <w:t>B6 · QUIZ RELÁMPAGO — hasta 20 PC</w:t>
-            </w:r>
-            <w:r>
-              <w:rPr>
-                <w:rtl w:val="0"/>
-              </w:rPr>
-            </w:r>
+            <w:r/>
           </w:p>
         </w:tc>
       </w:tr>
@@ -5530,21 +5509,16 @@
               <w:rPr/>
             </w:pPr>
             <w:r>
-              <w:rPr>
-                <w:rFonts w:ascii="Arial" w:cs="Arial" w:eastAsia="Arial" w:hAnsi="Arial"/>
-                <w:b w:val="1"/>
-                <w:bCs w:val="1"/>
-                <w:color w:val="0e8a5f"/>
-                <w:sz w:val="18"/>
-                <w:szCs w:val="18"/>
-                <w:rtl w:val="0"/>
-              </w:rPr>
-              <w:t>⚡ ⚡ PREGUNTA RELÁMPAGO EN CHAT (YOUTUBE LIVE)</w:t>
-            </w:r>
-            <w:r>
-              <w:rPr>
-                <w:rtl w:val="0"/>
-              </w:rPr>
+              <w:t>⚡ PREGUNTA RELÁMPAGO EN CHAT (YOUTUBE LIVE — HASTA 20 PC)</w:t>
+              <w:br/>
+              <w:t>Juan lanza 1 sola pregunta rápida al chat de YouTube:</w:t>
+              <w:br/>
+              <w:t>“¿En cuál campo de la bitácora deja huellas tu Saboteador?”</w:t>
+              <w:br/>
+              <w:t>A) El plan · B) El resultado · C) El estado emocional ✓ · D) La lección</w:t>
+              <w:br/>
+              <w:br/>
+              <w:t>Juan celebra en voz alta al primer participante en responder "C" en el chat. El CM lo anota para sumar sus +20 Puntos de Control.</w:t>
             </w:r>
           </w:p>
           <w:p>
@@ -5552,122 +5526,28 @@
               <w:spacing w:after="50" w:lineRule="auto"/>
               <w:rPr/>
             </w:pPr>
-            <w:r>
-              <w:rPr>
-                <w:rFonts w:ascii="Calibri" w:cs="Calibri" w:eastAsia="Calibri" w:hAnsi="Calibri"/>
-                <w:b w:val="1"/>
-                <w:bCs w:val="1"/>
-                <w:color w:val="2a2f36"/>
-                <w:sz w:val="21"/>
-                <w:szCs w:val="21"/>
-                <w:rtl w:val="0"/>
-              </w:rPr>
-              <w:t xml:space="preserve">Q1: “¿Cuál es el campo de la bitácora donde el saboteador deja huellas?” </w:t>
-            </w:r>
-            <w:r>
-              <w:rPr>
-                <w:rFonts w:ascii="Calibri" w:cs="Calibri" w:eastAsia="Calibri" w:hAnsi="Calibri"/>
-                <w:color w:val="2a2f36"/>
-                <w:sz w:val="21"/>
-                <w:szCs w:val="21"/>
-                <w:rtl w:val="0"/>
-              </w:rPr>
-              <w:t>A) El plan · B) El resultado · C) El estado emocional ✓ · D) La lección</w:t>
-            </w:r>
-            <w:r>
-              <w:rPr>
-                <w:rtl w:val="0"/>
-              </w:rPr>
-            </w:r>
+            <w:r/>
           </w:p>
           <w:p>
             <w:pPr>
               <w:spacing w:after="50" w:lineRule="auto"/>
               <w:rPr/>
             </w:pPr>
-            <w:r>
-              <w:rPr>
-                <w:rFonts w:ascii="Calibri" w:cs="Calibri" w:eastAsia="Calibri" w:hAnsi="Calibri"/>
-                <w:b w:val="1"/>
-                <w:bCs w:val="1"/>
-                <w:color w:val="2a2f36"/>
-                <w:sz w:val="21"/>
-                <w:szCs w:val="21"/>
-                <w:rtl w:val="0"/>
-              </w:rPr>
-              <w:t xml:space="preserve">Q2: “Una pérdida que siguió el plan es...” </w:t>
-            </w:r>
-            <w:r>
-              <w:rPr>
-                <w:rFonts w:ascii="Calibri" w:cs="Calibri" w:eastAsia="Calibri" w:hAnsi="Calibri"/>
-                <w:color w:val="2a2f36"/>
-                <w:sz w:val="21"/>
-                <w:szCs w:val="21"/>
-                <w:rtl w:val="0"/>
-              </w:rPr>
-              <w:t>A) Un fracaso · B) Un costo operativo ✓ · C) Mala suerte · D) Señal de salir del mercado</w:t>
-            </w:r>
-            <w:r>
-              <w:rPr>
-                <w:rtl w:val="0"/>
-              </w:rPr>
-            </w:r>
+            <w:r/>
           </w:p>
           <w:p>
             <w:pPr>
               <w:spacing w:after="50" w:lineRule="auto"/>
               <w:rPr/>
             </w:pPr>
-            <w:r>
-              <w:rPr>
-                <w:rFonts w:ascii="Calibri" w:cs="Calibri" w:eastAsia="Calibri" w:hAnsi="Calibri"/>
-                <w:b w:val="1"/>
-                <w:bCs w:val="1"/>
-                <w:color w:val="2a2f36"/>
-                <w:sz w:val="21"/>
-                <w:szCs w:val="21"/>
-                <w:rtl w:val="0"/>
-              </w:rPr>
-              <w:t xml:space="preserve">Q3: “¿Qué le ganó el pulso al Vengador de Juan en el trade 3?” </w:t>
-            </w:r>
-            <w:r>
-              <w:rPr>
-                <w:rFonts w:ascii="Calibri" w:cs="Calibri" w:eastAsia="Calibri" w:hAnsi="Calibri"/>
-                <w:color w:val="2a2f36"/>
-                <w:sz w:val="21"/>
-                <w:szCs w:val="21"/>
-                <w:rtl w:val="0"/>
-              </w:rPr>
-              <w:t>A) Su experiencia · B) Su disciplina · C) Una regla escrita con anticipación ✓ · D) Un consejo</w:t>
-            </w:r>
-            <w:r>
-              <w:rPr>
-                <w:rtl w:val="0"/>
-              </w:rPr>
-            </w:r>
+            <w:r/>
           </w:p>
           <w:p>
             <w:pPr>
               <w:spacing w:after="50" w:lineRule="auto"/>
               <w:rPr/>
             </w:pPr>
-            <w:r>
-              <w:rPr>
-                <w:rFonts w:ascii="Calibri" w:cs="Calibri" w:eastAsia="Calibri" w:hAnsi="Calibri"/>
-                <w:i w:val="1"/>
-                <w:iCs w:val="1"/>
-                <w:color w:val="2a2f36"/>
-                <w:sz w:val="21"/>
-                <w:szCs w:val="21"/>
-                <w:rtl w:val="0"/>
-              </w:rPr>
-              <w:t>Juan celebra a los primeros en acertar por nombre. El CM registra para el leaderboard.</w:t>
-            </w:r>
-            <w:r>
-              <w:rPr>
-                <w:rtl w:val="0"/>
-              </w:rPr>
-            </w:r>
+            <w:r/>
           </w:p>
         </w:tc>
       </w:tr>

</xml_diff>